<commit_message>
Update historical label format and generation names
- Replace 'N slides: ...' prefix with trailing '(n Gen N morph)' parenthetical
- Add curation note parenthetical from Special column, placed between morph count and repository bracket
- Align section headings with Lasso gen_morph_label conventions (Gen I Fundatrices, Gen II Alate Virginoparae, Gen V Alate Sexuparae)
- Fix gen+morph keyed abbreviation lookup so Gen I aptera correctly abbreviates as fp

Co-Authored-By: Claude Sonnet 4.6 <noreply@anthropic.com>
</commit_message>
<xml_diff>
--- a/labels_output.docx
+++ b/labels_output.docx
@@ -828,12 +828,238 @@
         <w:pStyle w:val="Heading1"/>
       </w:pPr>
       <w:r>
-        <w:t>Flags — Data Discrepancies</w:t>
+        <w:t>Historical Morphometric Specimens</w:t>
       </w:r>
     </w:p>
     <w:p>
-      <w:r>
-        <w:t>United States of America: New Hampshire: Coos Co., Clade H+N: GenBank differs — 23-03: PX844243, 23-04: PX844244</w:t>
+      <w:pPr>
+        <w:pStyle w:val="Heading2"/>
+      </w:pPr>
+      <w:r>
+        <w:t>Generation I — Fundatrices</w:t>
+      </w:r>
+    </w:p>
+    <w:p>
+      <w:r>
+        <w:t xml:space="preserve">United States: Virginia, George Washington National Forest; 21viii1987; ex </w:t>
+      </w:r>
+      <w:r>
+        <w:rPr>
+          <w:i/>
+        </w:rPr>
+        <w:t>Hamamelis virginiana</w:t>
+      </w:r>
+      <w:r>
+        <w:t xml:space="preserve">; C. von Dohlen; </w:t>
+      </w:r>
+      <w:r>
+        <w:t>GWNF-87 #6, GWNF-87 #7</w:t>
+      </w:r>
+      <w:r>
+        <w:t>; (2 Gen I fp)</w:t>
+      </w:r>
+      <w:r>
+        <w:t xml:space="preserve"> [USU].</w:t>
+      </w:r>
+    </w:p>
+    <w:p>
+      <w:r>
+        <w:t xml:space="preserve">United States: Virginia, George Washington National Forest; 26vi1988; ex </w:t>
+      </w:r>
+      <w:r>
+        <w:rPr>
+          <w:i/>
+        </w:rPr>
+        <w:t>Hamamelis virginiana</w:t>
+      </w:r>
+      <w:r>
+        <w:t xml:space="preserve">; C. von Dohlen; </w:t>
+      </w:r>
+      <w:r>
+        <w:t>I-H-01, I-H-02</w:t>
+      </w:r>
+      <w:r>
+        <w:t>; (2 Gen I fp)</w:t>
+      </w:r>
+      <w:r>
+        <w:t xml:space="preserve"> [USU].</w:t>
+      </w:r>
+    </w:p>
+    <w:p>
+      <w:r>
+        <w:t xml:space="preserve">United States: West Virginia, Davis; ?; ex </w:t>
+      </w:r>
+      <w:r>
+        <w:rPr>
+          <w:i/>
+        </w:rPr>
+        <w:t>?</w:t>
+      </w:r>
+      <w:r>
+        <w:t xml:space="preserve">; D. Stern; </w:t>
+      </w:r>
+      <w:r>
+        <w:t>I-WV-01</w:t>
+      </w:r>
+      <w:r>
+        <w:t>; (1 Gen I fp)</w:t>
+      </w:r>
+      <w:r>
+        <w:t xml:space="preserve"> [USU].</w:t>
+      </w:r>
+    </w:p>
+    <w:p>
+      <w:pPr>
+        <w:pStyle w:val="Heading2"/>
+      </w:pPr>
+      <w:r>
+        <w:t>Generation II — Alate Virginoparae</w:t>
+      </w:r>
+    </w:p>
+    <w:p>
+      <w:r>
+        <w:t xml:space="preserve">United States: Illinois, Starved Rock State Park; 14viii1929; ex </w:t>
+      </w:r>
+      <w:r>
+        <w:rPr>
+          <w:i/>
+        </w:rPr>
+        <w:t>Hamamelis virginiana</w:t>
+      </w:r>
+      <w:r>
+        <w:t xml:space="preserve">; F. C. Hottes &amp; T. H. Frison; </w:t>
+      </w:r>
+      <w:r>
+        <w:t>Frison + Hotts: 8143a, Frison + Hotts: 8143b, Frison + Hotts: 8143d, Frison + Hotts: 8143f, Frison + Hotts: 8143g, Frison + Hotts: 8145a, Frison + Hotts: 8145b, Frison + Hotts: 8145c, Frison + Hotts: 8145d, Frison + Hotts: 8145e</w:t>
+      </w:r>
+      <w:r>
+        <w:t>; (10 Gen II al.)</w:t>
+      </w:r>
+      <w:r>
+        <w:t xml:space="preserve"> [INHS acc. 1061514, 1068547].</w:t>
+      </w:r>
+    </w:p>
+    <w:p>
+      <w:pPr>
+        <w:pStyle w:val="Heading2"/>
+      </w:pPr>
+      <w:r>
+        <w:t>Generation V — Alate Sexuparae</w:t>
+      </w:r>
+    </w:p>
+    <w:p>
+      <w:r>
+        <w:t xml:space="preserve">United States: Illinois, Carbondale; 4vi1928; ex </w:t>
+      </w:r>
+      <w:r>
+        <w:rPr>
+          <w:i/>
+        </w:rPr>
+        <w:t>Betula nigra</w:t>
+      </w:r>
+      <w:r>
+        <w:t xml:space="preserve">; F. C. Hottes &amp; T. H. Frison; </w:t>
+      </w:r>
+      <w:r>
+        <w:t>Frison + Hottes: 5791b, Frison + Hottes: 5791c, Frison + Hottes: 5791d, Frison + Hottes: 5791e, Frison + Hottes: 5791f, Frison + Hottes: 5792a, Frison + Hottes: 5792c, Frison + Hottes: 5792d, Frison + Hottes: 5792e, Frison + Hottes: 5792g, Frison + Hottes: 5792h</w:t>
+      </w:r>
+      <w:r>
+        <w:t>; (11 Gen V al.)</w:t>
+      </w:r>
+      <w:r>
+        <w:t xml:space="preserve"> [INHS acc. 1092556, 1092567].</w:t>
+      </w:r>
+    </w:p>
+    <w:p>
+      <w:r>
+        <w:t xml:space="preserve">United States: Maryland, Berwyn Heights; 24v1988; ex </w:t>
+      </w:r>
+      <w:r>
+        <w:rPr>
+          <w:i/>
+        </w:rPr>
+        <w:t>Betula nigra</w:t>
+      </w:r>
+      <w:r>
+        <w:t xml:space="preserve">; C. von Dohlen; </w:t>
+      </w:r>
+      <w:r>
+        <w:t>bls1, bls2, bls3, bls4-a, bls4-b, bls4-c, bls4-d, bls4-e, bls5a, bls5b, bls6a, bls6b, bls6c, bls6d</w:t>
+      </w:r>
+      <w:r>
+        <w:t>; (14 Gen V al.)</w:t>
+      </w:r>
+      <w:r>
+        <w:t xml:space="preserve"> [USU].</w:t>
+      </w:r>
+    </w:p>
+    <w:p>
+      <w:r>
+        <w:t xml:space="preserve">United States: Minnesota, Minneapolis; 8v1887; ex </w:t>
+      </w:r>
+      <w:r>
+        <w:rPr>
+          <w:i/>
+        </w:rPr>
+        <w:t>Betula</w:t>
+      </w:r>
+      <w:r>
+        <w:t xml:space="preserve">; O. W. Oestlund; </w:t>
+      </w:r>
+      <w:r>
+        <w:t>Oestlund-Hormaphis papyracea-Lectotype Slide ★, Oestlund-Hormaphis papyracea-2046-1, Oestlund-Hormaphis papyracea-2046-2, Oestlund-Hormaphis papyracea-2046-3, Oestlund-Hormaphis papyracea-2046-4, Oestlund-Hormaphis papyracea-2046-5, Oestlund-Hormaphis papyracea-2046-6, Oestlund-Hormaphis papyracea-2046-7, Oestlund-Hormaphis papyracea-2046-A-17, Oestlund-Hormaphis papyracea-2046-A-22</w:t>
+      </w:r>
+      <w:r>
+        <w:t>; (10 Gen V al.)</w:t>
+      </w:r>
+      <w:r>
+        <w:t xml:space="preserve"> (remounted xi.1968 in balsam) [UMSP acc. 297758].</w:t>
+      </w:r>
+    </w:p>
+    <w:p>
+      <w:r>
+        <w:t xml:space="preserve">United States: Minnesota, Minneapolis; 30vi1897; ex </w:t>
+      </w:r>
+      <w:r>
+        <w:rPr>
+          <w:i/>
+        </w:rPr>
+        <w:t>Betula</w:t>
+      </w:r>
+      <w:r>
+        <w:t xml:space="preserve">; O. W. Oestlund; </w:t>
+      </w:r>
+      <w:r>
+        <w:t>Oestlund-Hormaphis papyracea-3775-8, Oestlund-Hormaphis papyracea-3775-9</w:t>
+      </w:r>
+      <w:r>
+        <w:t>; (2 Gen V al.)</w:t>
+      </w:r>
+      <w:r>
+        <w:t xml:space="preserve"> (remounted xi.1968 in balsam) [UMSP].</w:t>
+      </w:r>
+    </w:p>
+    <w:p>
+      <w:r>
+        <w:t xml:space="preserve">United States: New Hampshire, Pittsburg (transplant to Idaho, Pocatello); 27vi1990; ex </w:t>
+      </w:r>
+      <w:r>
+        <w:rPr>
+          <w:i/>
+        </w:rPr>
+        <w:t>Betula alleghaniensis</w:t>
+      </w:r>
+      <w:r>
+        <w:t xml:space="preserve">; C. von Dohlen; </w:t>
+      </w:r>
+      <w:r>
+        <w:t>134a, 134c, 134d, 135a, 135c, 136c, 136d, 137a, hni1/c, hni1/e, hni1/f, hni1/g, hni1/h, hni1/i, hni2/a, hni2/b, hni2/c, hni2/d</w:t>
+      </w:r>
+      <w:r>
+        <w:t>; (18 Gen V al.)</w:t>
+      </w:r>
+      <w:r>
+        <w:t xml:space="preserve"> [USU].</w:t>
       </w:r>
     </w:p>
     <w:p/>
@@ -842,357 +1068,21 @@
         <w:pStyle w:val="Heading1"/>
       </w:pPr>
       <w:r>
-        <w:t>Flagged — No Match in CollectionData.csv</w:t>
+        <w:t>Flags — Data Discrepancies</w:t>
       </w:r>
     </w:p>
     <w:p>
       <w:r>
-        <w:t>CvD: '87 #6; GWNF, VA</w:t>
+        <w:t>United States of America: New Hampshire: Coos Co., Clade H+N: GenBank differs — 23-03: PX844243, 23-04: PX844244</w:t>
       </w:r>
     </w:p>
+    <w:p/>
     <w:p>
-      <w:r>
-        <w:t>CvD: '87 #7; GWNF, VA</w:t>
-      </w:r>
-    </w:p>
-    <w:p>
-      <w:r>
-        <w:t>CvD: '88 #1; GWNF, VA</w:t>
-      </w:r>
-    </w:p>
-    <w:p>
-      <w:r>
-        <w:t>CvD: '88 #2; GWNF, VA</w:t>
-      </w:r>
-    </w:p>
-    <w:p>
-      <w:r>
-        <w:t>CvD: 134a; NH &gt; ID</w:t>
-      </w:r>
-    </w:p>
-    <w:p>
-      <w:r>
-        <w:t>CvD: 134c; NH &gt; ID</w:t>
-      </w:r>
-    </w:p>
-    <w:p>
-      <w:r>
-        <w:t>CvD: 134d; NH &gt; ID</w:t>
-      </w:r>
-    </w:p>
-    <w:p>
-      <w:r>
-        <w:t>CvD: 135a; NH &gt; ID</w:t>
-      </w:r>
-    </w:p>
-    <w:p>
-      <w:r>
-        <w:t>CvD: 135c; NH &gt; ID</w:t>
-      </w:r>
-    </w:p>
-    <w:p>
-      <w:r>
-        <w:t>CvD: 136c; NH &gt; ID</w:t>
-      </w:r>
-    </w:p>
-    <w:p>
-      <w:r>
-        <w:t>CvD: 136d; NH &gt; ID</w:t>
-      </w:r>
-    </w:p>
-    <w:p>
-      <w:r>
-        <w:t>CvD: 137a; NH &gt; ID</w:t>
-      </w:r>
-    </w:p>
-    <w:p>
-      <w:r>
-        <w:t>CvD: bls1; BH, MD</w:t>
-      </w:r>
-    </w:p>
-    <w:p>
-      <w:r>
-        <w:t>CvD: bls2; BH, MD</w:t>
-      </w:r>
-    </w:p>
-    <w:p>
-      <w:r>
-        <w:t>CvD: bls3; BH, MD</w:t>
-      </w:r>
-    </w:p>
-    <w:p>
-      <w:r>
-        <w:t>CvD: bls4-a; BH, MD</w:t>
-      </w:r>
-    </w:p>
-    <w:p>
-      <w:r>
-        <w:t>CvD: bls4-b; BH, MD</w:t>
-      </w:r>
-    </w:p>
-    <w:p>
-      <w:r>
-        <w:t>CvD: bls4-c; BH, MD</w:t>
-      </w:r>
-    </w:p>
-    <w:p>
-      <w:r>
-        <w:t>CvD: bls4-d; BH, MD</w:t>
-      </w:r>
-    </w:p>
-    <w:p>
-      <w:r>
-        <w:t>CvD: bls4-e; BH, MD</w:t>
-      </w:r>
-    </w:p>
-    <w:p>
-      <w:r>
-        <w:t>CvD: bls5a; BH, MD</w:t>
-      </w:r>
-    </w:p>
-    <w:p>
-      <w:r>
-        <w:t>CvD: bls5b; BH, MD</w:t>
-      </w:r>
-    </w:p>
-    <w:p>
-      <w:r>
-        <w:t>CvD: bls6a; BH, MD</w:t>
-      </w:r>
-    </w:p>
-    <w:p>
-      <w:r>
-        <w:t>CvD: bls6b; BH, MD</w:t>
-      </w:r>
-    </w:p>
-    <w:p>
-      <w:r>
-        <w:t>CvD: bls6c; BH, MD</w:t>
-      </w:r>
-    </w:p>
-    <w:p>
-      <w:r>
-        <w:t>CvD: bls6d; BH, MD</w:t>
-      </w:r>
-    </w:p>
-    <w:p>
-      <w:r>
-        <w:t>CvD: hni1/c; NH &gt; ID</w:t>
-      </w:r>
-    </w:p>
-    <w:p>
-      <w:r>
-        <w:t>CvD: hni1/e; NH &gt; ID</w:t>
-      </w:r>
-    </w:p>
-    <w:p>
-      <w:r>
-        <w:t>CvD: hni1/f; NH &gt; ID</w:t>
-      </w:r>
-    </w:p>
-    <w:p>
-      <w:r>
-        <w:t>CvD: hni1/g; NH &gt; ID</w:t>
-      </w:r>
-    </w:p>
-    <w:p>
-      <w:r>
-        <w:t>CvD: hni1/h; NH &gt; ID</w:t>
-      </w:r>
-    </w:p>
-    <w:p>
-      <w:r>
-        <w:t>CvD: hni1/i; NH &gt; ID</w:t>
-      </w:r>
-    </w:p>
-    <w:p>
-      <w:r>
-        <w:t>CvD: hni2/a; NH &gt; ID</w:t>
-      </w:r>
-    </w:p>
-    <w:p>
-      <w:r>
-        <w:t>CvD: hni2/b; NH &gt; ID</w:t>
-      </w:r>
-    </w:p>
-    <w:p>
-      <w:r>
-        <w:t>CvD: hni2/c; NH &gt; ID</w:t>
-      </w:r>
-    </w:p>
-    <w:p>
-      <w:r>
-        <w:t>CvD: hni2/d; NH &gt; ID</w:t>
-      </w:r>
-    </w:p>
-    <w:p>
-      <w:r>
-        <w:t>DS: Davis, WV</w:t>
-      </w:r>
-    </w:p>
-    <w:p>
-      <w:r>
-        <w:t>F+H: 5791b; C, IL</w:t>
-      </w:r>
-    </w:p>
-    <w:p>
-      <w:r>
-        <w:t>F+H: 5791c; C, IL</w:t>
-      </w:r>
-    </w:p>
-    <w:p>
-      <w:r>
-        <w:t>F+H: 5791d; C, IL</w:t>
-      </w:r>
-    </w:p>
-    <w:p>
-      <w:r>
-        <w:t>F+H: 5791e; C, IL</w:t>
-      </w:r>
-    </w:p>
-    <w:p>
-      <w:r>
-        <w:t>F+H: 5791f; C, IL</w:t>
-      </w:r>
-    </w:p>
-    <w:p>
-      <w:r>
-        <w:t>F+H: 5792a; C, IL</w:t>
-      </w:r>
-    </w:p>
-    <w:p>
-      <w:r>
-        <w:t>F+H: 5792c; C, IL</w:t>
-      </w:r>
-    </w:p>
-    <w:p>
-      <w:r>
-        <w:t>F+H: 5792d; C, IL</w:t>
-      </w:r>
-    </w:p>
-    <w:p>
-      <w:r>
-        <w:t>F+H: 5792e; C, IL</w:t>
-      </w:r>
-    </w:p>
-    <w:p>
-      <w:r>
-        <w:t>F+H: 5792g; C, IL</w:t>
-      </w:r>
-    </w:p>
-    <w:p>
-      <w:r>
-        <w:t>F+H: 5792h; C, IL</w:t>
-      </w:r>
-    </w:p>
-    <w:p>
-      <w:r>
-        <w:t>F+H: 8143a; SR, IL</w:t>
-      </w:r>
-    </w:p>
-    <w:p>
-      <w:r>
-        <w:t>F+H: 8143b; SR, IL</w:t>
-      </w:r>
-    </w:p>
-    <w:p>
-      <w:r>
-        <w:t>F+H: 8143d; SR, IL</w:t>
-      </w:r>
-    </w:p>
-    <w:p>
-      <w:r>
-        <w:t>F+H: 8143f; SR, IL</w:t>
-      </w:r>
-    </w:p>
-    <w:p>
-      <w:r>
-        <w:t>F+H: 8143g; SR, IL</w:t>
-      </w:r>
-    </w:p>
-    <w:p>
-      <w:r>
-        <w:t>F+H: 8145a; SR, IL</w:t>
-      </w:r>
-    </w:p>
-    <w:p>
-      <w:r>
-        <w:t>F+H: 8145b; SR, IL</w:t>
-      </w:r>
-    </w:p>
-    <w:p>
-      <w:r>
-        <w:t>F+H: 8145c; SR, IL</w:t>
-      </w:r>
-    </w:p>
-    <w:p>
-      <w:r>
-        <w:t>F+H: 8145d; SR, IL</w:t>
-      </w:r>
-    </w:p>
-    <w:p>
-      <w:r>
-        <w:t>F+H: 8145e; SR, IL</w:t>
-      </w:r>
-    </w:p>
-    <w:p>
-      <w:r>
-        <w:t>Lectotype: H. papyracea</w:t>
-      </w:r>
-    </w:p>
-    <w:p>
-      <w:r>
-        <w:t>O: H. papyracea - 1; M, MN</w:t>
-      </w:r>
-    </w:p>
-    <w:p>
-      <w:r>
-        <w:t>O: H. papyracea - 2; M, MN</w:t>
-      </w:r>
-    </w:p>
-    <w:p>
-      <w:r>
-        <w:t>O: H. papyracea - 3; M, MN</w:t>
-      </w:r>
-    </w:p>
-    <w:p>
-      <w:r>
-        <w:t>O: H. papyracea - 4; M, MN</w:t>
-      </w:r>
-    </w:p>
-    <w:p>
-      <w:r>
-        <w:t>O: H. papyracea - 5; M, MN</w:t>
-      </w:r>
-    </w:p>
-    <w:p>
-      <w:r>
-        <w:t>O: H. papyracea - 6; M, MN</w:t>
-      </w:r>
-    </w:p>
-    <w:p>
-      <w:r>
-        <w:t>O: H. papyracea - 7; M, MN</w:t>
-      </w:r>
-    </w:p>
-    <w:p>
-      <w:r>
-        <w:t>O: H. papyracea - 8; M, MN</w:t>
-      </w:r>
-    </w:p>
-    <w:p>
-      <w:r>
-        <w:t>O: H. papyracea - 9; M, MN</w:t>
-      </w:r>
-    </w:p>
-    <w:p>
-      <w:r>
-        <w:t>O: H. papyracea A-17; M, MN</w:t>
-      </w:r>
-    </w:p>
-    <w:p>
-      <w:r>
-        <w:t>O: H. papyracea A-22; M, MN</w:t>
+      <w:pPr>
+        <w:pStyle w:val="Heading1"/>
+      </w:pPr>
+      <w:r>
+        <w:t>Flagged — No Match in CollectionData.csv</w:t>
       </w:r>
     </w:p>
     <w:sectPr>

</xml_diff>

<commit_message>
Restructure historical labels to publication-ready taxonomic format
- Group specimens by Historic_ID (not Slide_ID/Collection_ID); letter-variant
  rows on the same slide collapse to one ID with cumulative specimen count
- Pull type specimens (Lectotype: prefix) into separate Type Material section
  at top of historical portion of document
- New label format: Location, Host (ital.), date, Collector (n morph; IDs) [REPO].
- Morph labels updated to match Lasso gen_morph_label conventions:
  Gen I fund., Gen II al. Vp., Gen V al. Sp., etc.
- Expand 'United States' → 'United States of America' in location normalization

Co-Authored-By: Claude Sonnet 4.6 <noreply@anthropic.com>
</commit_message>
<xml_diff>
--- a/labels_output.docx
+++ b/labels_output.docx
@@ -828,7 +828,7 @@
         <w:pStyle w:val="Heading1"/>
       </w:pPr>
       <w:r>
-        <w:t>Historical Morphometric Specimens</w:t>
+        <w:t>Type Material</w:t>
       </w:r>
     </w:p>
     <w:p>
@@ -836,76 +836,42 @@
         <w:pStyle w:val="Heading2"/>
       </w:pPr>
       <w:r>
-        <w:t>Generation I — Fundatrices</w:t>
+        <w:t>Lectotype</w:t>
       </w:r>
     </w:p>
     <w:p>
       <w:r>
-        <w:t xml:space="preserve">United States: Virginia, George Washington National Forest; 21viii1987; ex </w:t>
+        <w:rPr>
+          <w:b/>
+        </w:rPr>
+        <w:t>Lectotype</w:t>
+      </w:r>
+      <w:r>
+        <w:t xml:space="preserve"> ♀ (Gen V al. Sp.): United States of America: Minnesota, Minneapolis, </w:t>
       </w:r>
       <w:r>
         <w:rPr>
           <w:i/>
         </w:rPr>
-        <w:t>Hamamelis virginiana</w:t>
-      </w:r>
-      <w:r>
-        <w:t xml:space="preserve">; C. von Dohlen; </w:t>
-      </w:r>
-      <w:r>
-        <w:t>GWNF-87 #6, GWNF-87 #7</w:t>
-      </w:r>
-      <w:r>
-        <w:t>; (2 Gen I fp)</w:t>
-      </w:r>
-      <w:r>
-        <w:t xml:space="preserve"> [USU].</w:t>
+        <w:t>Betula</w:t>
+      </w:r>
+      <w:r>
+        <w:t>, 8.v.1887, O. W. Oestlund</w:t>
+      </w:r>
+      <w:r>
+        <w:t xml:space="preserve"> (remounted xi.1968 in balsam)</w:t>
+      </w:r>
+      <w:r>
+        <w:t xml:space="preserve"> [UMSP acc. 297758].</w:t>
       </w:r>
     </w:p>
+    <w:p/>
     <w:p>
-      <w:r>
-        <w:t xml:space="preserve">United States: Virginia, George Washington National Forest; 26vi1988; ex </w:t>
-      </w:r>
-      <w:r>
-        <w:rPr>
-          <w:i/>
-        </w:rPr>
-        <w:t>Hamamelis virginiana</w:t>
-      </w:r>
-      <w:r>
-        <w:t xml:space="preserve">; C. von Dohlen; </w:t>
-      </w:r>
-      <w:r>
-        <w:t>I-H-01, I-H-02</w:t>
-      </w:r>
-      <w:r>
-        <w:t>; (2 Gen I fp)</w:t>
-      </w:r>
-      <w:r>
-        <w:t xml:space="preserve"> [USU].</w:t>
-      </w:r>
-    </w:p>
-    <w:p>
-      <w:r>
-        <w:t xml:space="preserve">United States: West Virginia, Davis; ?; ex </w:t>
-      </w:r>
-      <w:r>
-        <w:rPr>
-          <w:i/>
-        </w:rPr>
-        <w:t>?</w:t>
-      </w:r>
-      <w:r>
-        <w:t xml:space="preserve">; D. Stern; </w:t>
-      </w:r>
-      <w:r>
-        <w:t>I-WV-01</w:t>
-      </w:r>
-      <w:r>
-        <w:t>; (1 Gen I fp)</w:t>
-      </w:r>
-      <w:r>
-        <w:t xml:space="preserve"> [USU].</w:t>
+      <w:pPr>
+        <w:pStyle w:val="Heading1"/>
+      </w:pPr>
+      <w:r>
+        <w:t>Historical Morphometric Specimens</w:t>
       </w:r>
     </w:p>
     <w:p>
@@ -913,12 +879,12 @@
         <w:pStyle w:val="Heading2"/>
       </w:pPr>
       <w:r>
-        <w:t>Generation II — Alate Virginoparae</w:t>
+        <w:t>Generation I — Fundatrices</w:t>
       </w:r>
     </w:p>
     <w:p>
       <w:r>
-        <w:t xml:space="preserve">United States: Illinois, Starved Rock State Park; 14viii1929; ex </w:t>
+        <w:t xml:space="preserve">United States of America: Virginia, George Washington National Forest, </w:t>
       </w:r>
       <w:r>
         <w:rPr>
@@ -927,16 +893,53 @@
         <w:t>Hamamelis virginiana</w:t>
       </w:r>
       <w:r>
-        <w:t xml:space="preserve">; F. C. Hottes &amp; T. H. Frison; </w:t>
-      </w:r>
-      <w:r>
-        <w:t>Frison + Hotts: 8143a, Frison + Hotts: 8143b, Frison + Hotts: 8143d, Frison + Hotts: 8143f, Frison + Hotts: 8143g, Frison + Hotts: 8145a, Frison + Hotts: 8145b, Frison + Hotts: 8145c, Frison + Hotts: 8145d, Frison + Hotts: 8145e</w:t>
-      </w:r>
-      <w:r>
-        <w:t>; (10 Gen II al.)</w:t>
-      </w:r>
-      <w:r>
-        <w:t xml:space="preserve"> [INHS acc. 1061514, 1068547].</w:t>
+        <w:t>, 21.viii.1987, C. von Dohlen</w:t>
+      </w:r>
+      <w:r>
+        <w:t xml:space="preserve"> (2 Gen I fund.; 6, 7)</w:t>
+      </w:r>
+      <w:r>
+        <w:t xml:space="preserve"> [USU].</w:t>
+      </w:r>
+    </w:p>
+    <w:p>
+      <w:r>
+        <w:t xml:space="preserve">United States of America: Virginia, George Washington National Forest, </w:t>
+      </w:r>
+      <w:r>
+        <w:rPr>
+          <w:i/>
+        </w:rPr>
+        <w:t>Hamamelis virginiana</w:t>
+      </w:r>
+      <w:r>
+        <w:t>, 26.vi.1988, C. von Dohlen</w:t>
+      </w:r>
+      <w:r>
+        <w:t xml:space="preserve"> (2 Gen I fund.; I-H-01, I-H-02)</w:t>
+      </w:r>
+      <w:r>
+        <w:t xml:space="preserve"> [USU].</w:t>
+      </w:r>
+    </w:p>
+    <w:p>
+      <w:r>
+        <w:t xml:space="preserve">United States of America: West Virginia, Davis, </w:t>
+      </w:r>
+      <w:r>
+        <w:rPr>
+          <w:i/>
+        </w:rPr>
+        <w:t>?</w:t>
+      </w:r>
+      <w:r>
+        <w:t>, ?, D. Stern</w:t>
+      </w:r>
+      <w:r>
+        <w:t xml:space="preserve"> (1 Gen I fund.; I-WV-01)</w:t>
+      </w:r>
+      <w:r>
+        <w:t xml:space="preserve"> [USU].</w:t>
       </w:r>
     </w:p>
     <w:p>
@@ -944,12 +947,40 @@
         <w:pStyle w:val="Heading2"/>
       </w:pPr>
       <w:r>
-        <w:t>Generation V — Alate Sexuparae</w:t>
+        <w:t>Generation II — Alate Virginoparae</w:t>
       </w:r>
     </w:p>
     <w:p>
       <w:r>
-        <w:t xml:space="preserve">United States: Illinois, Carbondale; 4vi1928; ex </w:t>
+        <w:t xml:space="preserve">United States of America: Illinois, Starved Rock State Park, </w:t>
+      </w:r>
+      <w:r>
+        <w:rPr>
+          <w:i/>
+        </w:rPr>
+        <w:t>Hamamelis virginiana</w:t>
+      </w:r>
+      <w:r>
+        <w:t>, 14.viii.1929, F. C. Hottes &amp; T. H. Frison</w:t>
+      </w:r>
+      <w:r>
+        <w:t xml:space="preserve"> (10 Gen II al. Vp.; S1.8143, S1.8145)</w:t>
+      </w:r>
+      <w:r>
+        <w:t xml:space="preserve"> [INHS acc. 1061514, 1068547].</w:t>
+      </w:r>
+    </w:p>
+    <w:p>
+      <w:pPr>
+        <w:pStyle w:val="Heading2"/>
+      </w:pPr>
+      <w:r>
+        <w:t>Generation V — Alate Sexuparae</w:t>
+      </w:r>
+    </w:p>
+    <w:p>
+      <w:r>
+        <w:t xml:space="preserve">United States of America: Illinois, Carbondale, </w:t>
       </w:r>
       <w:r>
         <w:rPr>
@@ -958,13 +989,10 @@
         <w:t>Betula nigra</w:t>
       </w:r>
       <w:r>
-        <w:t xml:space="preserve">; F. C. Hottes &amp; T. H. Frison; </w:t>
-      </w:r>
-      <w:r>
-        <w:t>Frison + Hottes: 5791b, Frison + Hottes: 5791c, Frison + Hottes: 5791d, Frison + Hottes: 5791e, Frison + Hottes: 5791f, Frison + Hottes: 5792a, Frison + Hottes: 5792c, Frison + Hottes: 5792d, Frison + Hottes: 5792e, Frison + Hottes: 5792g, Frison + Hottes: 5792h</w:t>
-      </w:r>
-      <w:r>
-        <w:t>; (11 Gen V al.)</w:t>
+        <w:t>, 4.vi.1928, F. C. Hottes &amp; T. H. Frison</w:t>
+      </w:r>
+      <w:r>
+        <w:t xml:space="preserve"> (11 Gen V al. Sp.; S1.5791, S1.5792)</w:t>
       </w:r>
       <w:r>
         <w:t xml:space="preserve"> [INHS acc. 1092556, 1092567].</w:t>
@@ -972,7 +1000,7 @@
     </w:p>
     <w:p>
       <w:r>
-        <w:t xml:space="preserve">United States: Maryland, Berwyn Heights; 24v1988; ex </w:t>
+        <w:t xml:space="preserve">United States of America: Maryland, Berwyn Heights, </w:t>
       </w:r>
       <w:r>
         <w:rPr>
@@ -981,13 +1009,10 @@
         <w:t>Betula nigra</w:t>
       </w:r>
       <w:r>
-        <w:t xml:space="preserve">; C. von Dohlen; </w:t>
-      </w:r>
-      <w:r>
-        <w:t>bls1, bls2, bls3, bls4-a, bls4-b, bls4-c, bls4-d, bls4-e, bls5a, bls5b, bls6a, bls6b, bls6c, bls6d</w:t>
-      </w:r>
-      <w:r>
-        <w:t>; (14 Gen V al.)</w:t>
+        <w:t>, 24.v.1988, C. von Dohlen</w:t>
+      </w:r>
+      <w:r>
+        <w:t xml:space="preserve"> (14 Gen V al. Sp.; bls1, bls2, bls3, bls4, bls5, bls6)</w:t>
       </w:r>
       <w:r>
         <w:t xml:space="preserve"> [USU].</w:t>
@@ -995,7 +1020,7 @@
     </w:p>
     <w:p>
       <w:r>
-        <w:t xml:space="preserve">United States: Minnesota, Minneapolis; 8v1887; ex </w:t>
+        <w:t xml:space="preserve">United States of America: Minnesota, Minneapolis, </w:t>
       </w:r>
       <w:r>
         <w:rPr>
@@ -1004,21 +1029,18 @@
         <w:t>Betula</w:t>
       </w:r>
       <w:r>
-        <w:t xml:space="preserve">; O. W. Oestlund; </w:t>
-      </w:r>
-      <w:r>
-        <w:t>Oestlund-Hormaphis papyracea-Lectotype Slide ★, Oestlund-Hormaphis papyracea-2046-1, Oestlund-Hormaphis papyracea-2046-2, Oestlund-Hormaphis papyracea-2046-3, Oestlund-Hormaphis papyracea-2046-4, Oestlund-Hormaphis papyracea-2046-5, Oestlund-Hormaphis papyracea-2046-6, Oestlund-Hormaphis papyracea-2046-7, Oestlund-Hormaphis papyracea-2046-A-17, Oestlund-Hormaphis papyracea-2046-A-22</w:t>
-      </w:r>
-      <w:r>
-        <w:t>; (10 Gen V al.)</w:t>
-      </w:r>
-      <w:r>
-        <w:t xml:space="preserve"> (remounted xi.1968 in balsam) [UMSP acc. 297758].</w:t>
+        <w:t>, 8.v.1887, O. W. Oestlund</w:t>
+      </w:r>
+      <w:r>
+        <w:t xml:space="preserve"> (9 Gen V al. Sp.; 2046, 2046 A-17, 2046 A-22)</w:t>
+      </w:r>
+      <w:r>
+        <w:t xml:space="preserve"> (remounted xi.1968 in balsam) [UMSP].</w:t>
       </w:r>
     </w:p>
     <w:p>
       <w:r>
-        <w:t xml:space="preserve">United States: Minnesota, Minneapolis; 30vi1897; ex </w:t>
+        <w:t xml:space="preserve">United States of America: Minnesota, Minneapolis, </w:t>
       </w:r>
       <w:r>
         <w:rPr>
@@ -1027,13 +1049,10 @@
         <w:t>Betula</w:t>
       </w:r>
       <w:r>
-        <w:t xml:space="preserve">; O. W. Oestlund; </w:t>
-      </w:r>
-      <w:r>
-        <w:t>Oestlund-Hormaphis papyracea-3775-8, Oestlund-Hormaphis papyracea-3775-9</w:t>
-      </w:r>
-      <w:r>
-        <w:t>; (2 Gen V al.)</w:t>
+        <w:t>, 30.vi.1897, O. W. Oestlund</w:t>
+      </w:r>
+      <w:r>
+        <w:t xml:space="preserve"> (2 Gen V al. Sp.; 3775)</w:t>
       </w:r>
       <w:r>
         <w:t xml:space="preserve"> (remounted xi.1968 in balsam) [UMSP].</w:t>
@@ -1041,7 +1060,7 @@
     </w:p>
     <w:p>
       <w:r>
-        <w:t xml:space="preserve">United States: New Hampshire, Pittsburg (transplant to Idaho, Pocatello); 27vi1990; ex </w:t>
+        <w:t xml:space="preserve">United States of America: New Hampshire, Pittsburg (transplant to Idaho, Pocatello), </w:t>
       </w:r>
       <w:r>
         <w:rPr>
@@ -1050,13 +1069,10 @@
         <w:t>Betula alleghaniensis</w:t>
       </w:r>
       <w:r>
-        <w:t xml:space="preserve">; C. von Dohlen; </w:t>
-      </w:r>
-      <w:r>
-        <w:t>134a, 134c, 134d, 135a, 135c, 136c, 136d, 137a, hni1/c, hni1/e, hni1/f, hni1/g, hni1/h, hni1/i, hni2/a, hni2/b, hni2/c, hni2/d</w:t>
-      </w:r>
-      <w:r>
-        <w:t>; (18 Gen V al.)</w:t>
+        <w:t>, 27.vi.1990, C. von Dohlen</w:t>
+      </w:r>
+      <w:r>
+        <w:t xml:space="preserve"> (18 Gen V al. Sp.; 134, 135, 136, 137, hni1, hni2)</w:t>
       </w:r>
       <w:r>
         <w:t xml:space="preserve"> [USU].</w:t>

</xml_diff>

<commit_message>
Standardize gen morph labels to lowercase B&E convention
gen. I fund. / gen. II al. vp. / gen. IV apt. vp. / gen. V apt. vp. / gen. V al. sp.
Applied to modern label gen breakdown parentheticals and historical count parentheticals.

Co-Authored-By: Claude Sonnet 4.6 <noreply@anthropic.com>
</commit_message>
<xml_diff>
--- a/labels_output.docx
+++ b/labels_output.docx
@@ -33,7 +33,7 @@
         <w:t xml:space="preserve">, Coll. ID: </w:t>
       </w:r>
       <w:r>
-        <w:t>99-57 (2 genIV, 10 genVapt).</w:t>
+        <w:t>99-57 (2 gen. IV apt. vp., 10 gen. V apt. vp.).</w:t>
       </w:r>
     </w:p>
     <w:p>
@@ -59,7 +59,7 @@
         <w:t xml:space="preserve">, Coll. ID: </w:t>
       </w:r>
       <w:r>
-        <w:t>23-01 (8 genIV).</w:t>
+        <w:t>23-01 (8 gen. IV apt. vp.).</w:t>
       </w:r>
     </w:p>
     <w:p>
@@ -85,10 +85,10 @@
         <w:t xml:space="preserve">, Coll. ID: </w:t>
       </w:r>
       <w:r>
-        <w:t xml:space="preserve">23-20 (1 genI), </w:t>
-      </w:r>
-      <w:r>
-        <w:t>23-30 (1 genI, 6 genII).</w:t>
+        <w:t xml:space="preserve">23-20 (1 gen. I fund.), </w:t>
+      </w:r>
+      <w:r>
+        <w:t>23-30 (1 gen. I fund., 6 gen. II al. vp.).</w:t>
       </w:r>
     </w:p>
     <w:p>
@@ -114,10 +114,10 @@
         <w:t xml:space="preserve">, Coll. ID: </w:t>
       </w:r>
       <w:r>
-        <w:t xml:space="preserve">23-113 (1 genI, 1 genII), </w:t>
-      </w:r>
-      <w:r>
-        <w:t xml:space="preserve">23-116 (1 genI, 1 genII); </w:t>
+        <w:t xml:space="preserve">23-113 (1 gen. I fund., 1 gen. II al. vp.), </w:t>
+      </w:r>
+      <w:r>
+        <w:t xml:space="preserve">23-116 (1 gen. I fund., 1 gen. II al. vp.); </w:t>
       </w:r>
       <w:r>
         <w:t xml:space="preserve">ex </w:t>
@@ -132,7 +132,7 @@
         <w:t xml:space="preserve">, Coll. ID: </w:t>
       </w:r>
       <w:r>
-        <w:t>23-105 (2 genI, 2 genII).</w:t>
+        <w:t>23-105 (2 gen. I fund., 2 gen. II al. vp.).</w:t>
       </w:r>
     </w:p>
     <w:p>
@@ -158,7 +158,7 @@
         <w:t xml:space="preserve">, Coll. ID: </w:t>
       </w:r>
       <w:r>
-        <w:t>99-22 (7 genValat).</w:t>
+        <w:t>99-22 (7 gen. V al. sp.).</w:t>
       </w:r>
     </w:p>
     <w:p>
@@ -184,7 +184,7 @@
         <w:t xml:space="preserve">, Coll. ID: </w:t>
       </w:r>
       <w:r>
-        <w:t>25-10 (6 genValat).</w:t>
+        <w:t>25-10 (6 gen. V al. sp.).</w:t>
       </w:r>
     </w:p>
     <w:p>
@@ -210,13 +210,13 @@
         <w:t xml:space="preserve">, Coll. ID: </w:t>
       </w:r>
       <w:r>
-        <w:t xml:space="preserve">23-53 (1 genI, 1 genII), </w:t>
-      </w:r>
-      <w:r>
-        <w:t xml:space="preserve">23-82 (1 genI, 1 genII), </w:t>
-      </w:r>
-      <w:r>
-        <w:t>23-83 (1 genI, 1 genII).</w:t>
+        <w:t xml:space="preserve">23-53 (1 gen. I fund., 1 gen. II al. vp.), </w:t>
+      </w:r>
+      <w:r>
+        <w:t xml:space="preserve">23-82 (1 gen. I fund., 1 gen. II al. vp.), </w:t>
+      </w:r>
+      <w:r>
+        <w:t>23-83 (1 gen. I fund., 1 gen. II al. vp.).</w:t>
       </w:r>
     </w:p>
     <w:p>
@@ -242,7 +242,7 @@
         <w:t xml:space="preserve">, Coll. ID: </w:t>
       </w:r>
       <w:r>
-        <w:t>25-08 (5 genValat).</w:t>
+        <w:t>25-08 (5 gen. V al. sp.).</w:t>
       </w:r>
     </w:p>
     <w:p>
@@ -268,7 +268,7 @@
         <w:t xml:space="preserve">, Coll. ID: </w:t>
       </w:r>
       <w:r>
-        <w:t>23-128 (1 genI, 2 genII).</w:t>
+        <w:t>23-128 (1 gen. I fund., 2 gen. II al. vp.).</w:t>
       </w:r>
     </w:p>
     <w:p>
@@ -294,7 +294,7 @@
         <w:t xml:space="preserve">, Coll. ID: </w:t>
       </w:r>
       <w:r>
-        <w:t>25-70 (1 genIV).</w:t>
+        <w:t>25-70 (1 gen. IV apt. vp.).</w:t>
       </w:r>
     </w:p>
     <w:p/>
@@ -329,7 +329,7 @@
         <w:t xml:space="preserve">, Coll. ID: </w:t>
       </w:r>
       <w:r>
-        <w:t xml:space="preserve">23-05 (2 genIV, 6 genVapt, 1 genValat); </w:t>
+        <w:t xml:space="preserve">23-05 (2 gen. IV apt. vp., 6 gen. V apt. vp., 1 gen. V al. sp.); </w:t>
       </w:r>
       <w:r>
         <w:t xml:space="preserve">ex </w:t>
@@ -347,10 +347,10 @@
         <w:t xml:space="preserve">, Coll. ID: </w:t>
       </w:r>
       <w:r>
-        <w:t xml:space="preserve">23-10 (2 genIV, 4 genVapt, 2 genValat), </w:t>
-      </w:r>
-      <w:r>
-        <w:t xml:space="preserve">23-11 (1 genValat); </w:t>
+        <w:t xml:space="preserve">23-10 (2 gen. IV apt. vp., 4 gen. V apt. vp., 2 gen. V al. sp.), </w:t>
+      </w:r>
+      <w:r>
+        <w:t xml:space="preserve">23-11 (1 gen. V al. sp.); </w:t>
       </w:r>
       <w:r>
         <w:t xml:space="preserve">ex </w:t>
@@ -368,7 +368,7 @@
         <w:t xml:space="preserve">, Coll. ID: </w:t>
       </w:r>
       <w:r>
-        <w:t xml:space="preserve">23-12 (2 genIV, 4 genVapt, 1 genValat); </w:t>
+        <w:t xml:space="preserve">23-12 (2 gen. IV apt. vp., 4 gen. V apt. vp., 1 gen. V al. sp.); </w:t>
       </w:r>
       <w:r>
         <w:t xml:space="preserve">ex </w:t>
@@ -386,10 +386,10 @@
         <w:t xml:space="preserve">, Coll. ID: </w:t>
       </w:r>
       <w:r>
-        <w:t xml:space="preserve">23-03 (1 genIV), </w:t>
-      </w:r>
-      <w:r>
-        <w:t>23-04 (4 genIV, 1 genVapt).</w:t>
+        <w:t xml:space="preserve">23-03 (1 gen. IV apt. vp.), </w:t>
+      </w:r>
+      <w:r>
+        <w:t>23-04 (4 gen. IV apt. vp., 1 gen. V apt. vp.).</w:t>
       </w:r>
     </w:p>
     <w:p>
@@ -415,7 +415,7 @@
         <w:t xml:space="preserve">, Coll. ID: </w:t>
       </w:r>
       <w:r>
-        <w:t>25-71 (6 genIV).</w:t>
+        <w:t>25-71 (6 gen. IV apt. vp.).</w:t>
       </w:r>
     </w:p>
     <w:p>
@@ -441,7 +441,7 @@
         <w:t xml:space="preserve">, Coll. ID: </w:t>
       </w:r>
       <w:r>
-        <w:t>25-73 (6 genIV).</w:t>
+        <w:t>25-73 (6 gen. IV apt. vp.).</w:t>
       </w:r>
     </w:p>
     <w:p>
@@ -467,13 +467,13 @@
         <w:t xml:space="preserve">, Coll. ID: </w:t>
       </w:r>
       <w:r>
-        <w:t xml:space="preserve">24-76 (1 genI), </w:t>
-      </w:r>
-      <w:r>
-        <w:t xml:space="preserve">24-78 (1 genI), </w:t>
-      </w:r>
-      <w:r>
-        <w:t>24-81 (1 genI).</w:t>
+        <w:t xml:space="preserve">24-76 (1 gen. I fund.), </w:t>
+      </w:r>
+      <w:r>
+        <w:t xml:space="preserve">24-78 (1 gen. I fund.), </w:t>
+      </w:r>
+      <w:r>
+        <w:t>24-81 (1 gen. I fund.).</w:t>
       </w:r>
     </w:p>
     <w:p>
@@ -499,7 +499,7 @@
         <w:t xml:space="preserve">, Coll. ID: </w:t>
       </w:r>
       <w:r>
-        <w:t xml:space="preserve">23-02 (7 genIV); </w:t>
+        <w:t xml:space="preserve">23-02 (7 gen. IV apt. vp.); </w:t>
       </w:r>
       <w:r>
         <w:t xml:space="preserve">ex </w:t>
@@ -517,22 +517,22 @@
         <w:t xml:space="preserve">, Coll. ID: </w:t>
       </w:r>
       <w:r>
-        <w:t xml:space="preserve">25-74 (1 genI), </w:t>
-      </w:r>
-      <w:r>
-        <w:t xml:space="preserve">25-75 (1 genI), </w:t>
-      </w:r>
-      <w:r>
-        <w:t xml:space="preserve">25-76 (1 genI), </w:t>
-      </w:r>
-      <w:r>
-        <w:t xml:space="preserve">25-77 (1 genI), </w:t>
-      </w:r>
-      <w:r>
-        <w:t xml:space="preserve">25-78 (1 genI), </w:t>
-      </w:r>
-      <w:r>
-        <w:t>25-80 (1 genI).</w:t>
+        <w:t xml:space="preserve">25-74 (1 gen. I fund.), </w:t>
+      </w:r>
+      <w:r>
+        <w:t xml:space="preserve">25-75 (1 gen. I fund.), </w:t>
+      </w:r>
+      <w:r>
+        <w:t xml:space="preserve">25-76 (1 gen. I fund.), </w:t>
+      </w:r>
+      <w:r>
+        <w:t xml:space="preserve">25-77 (1 gen. I fund.), </w:t>
+      </w:r>
+      <w:r>
+        <w:t xml:space="preserve">25-78 (1 gen. I fund.), </w:t>
+      </w:r>
+      <w:r>
+        <w:t>25-80 (1 gen. I fund.).</w:t>
       </w:r>
     </w:p>
     <w:p>
@@ -558,7 +558,7 @@
         <w:t xml:space="preserve">, Coll. ID: </w:t>
       </w:r>
       <w:r>
-        <w:t>94-27 (1 genIV, 9 genVapt).</w:t>
+        <w:t>94-27 (1 gen. IV apt. vp., 9 gen. V apt. vp.).</w:t>
       </w:r>
     </w:p>
     <w:p>
@@ -584,10 +584,10 @@
         <w:t xml:space="preserve">, Coll. ID: </w:t>
       </w:r>
       <w:r>
-        <w:t xml:space="preserve">23-127 (4 genII), </w:t>
-      </w:r>
-      <w:r>
-        <w:t>23-129 (6 genII).</w:t>
+        <w:t xml:space="preserve">23-127 (4 gen. II al. vp.), </w:t>
+      </w:r>
+      <w:r>
+        <w:t>23-129 (6 gen. II al. vp.).</w:t>
       </w:r>
     </w:p>
     <w:p>
@@ -613,10 +613,10 @@
         <w:t xml:space="preserve">, Coll. ID: </w:t>
       </w:r>
       <w:r>
-        <w:t xml:space="preserve">23-123 (3 genII), </w:t>
-      </w:r>
-      <w:r>
-        <w:t>23-124 (6 genII).</w:t>
+        <w:t xml:space="preserve">23-123 (3 gen. II al. vp.), </w:t>
+      </w:r>
+      <w:r>
+        <w:t>23-124 (6 gen. II al. vp.).</w:t>
       </w:r>
     </w:p>
     <w:p>
@@ -642,10 +642,10 @@
         <w:t xml:space="preserve">, Coll. ID: </w:t>
       </w:r>
       <w:r>
-        <w:t xml:space="preserve">25-19 (6 genValat), </w:t>
-      </w:r>
-      <w:r>
-        <w:t>25-21 (2 genValat).</w:t>
+        <w:t xml:space="preserve">25-19 (6 gen. V al. sp.), </w:t>
+      </w:r>
+      <w:r>
+        <w:t>25-21 (2 gen. V al. sp.).</w:t>
       </w:r>
     </w:p>
     <w:p>
@@ -671,7 +671,7 @@
         <w:t xml:space="preserve">, Coll. ID: </w:t>
       </w:r>
       <w:r>
-        <w:t>25-57 (8 genValat).</w:t>
+        <w:t>25-57 (8 gen. V al. sp.).</w:t>
       </w:r>
     </w:p>
     <w:p>
@@ -697,10 +697,10 @@
         <w:t xml:space="preserve">, Coll. ID: </w:t>
       </w:r>
       <w:r>
-        <w:t xml:space="preserve">23-06 (5 genI), </w:t>
-      </w:r>
-      <w:r>
-        <w:t>23-07 (1 genI).</w:t>
+        <w:t xml:space="preserve">23-06 (5 gen. I fund.), </w:t>
+      </w:r>
+      <w:r>
+        <w:t>23-07 (1 gen. I fund.).</w:t>
       </w:r>
     </w:p>
     <w:p>
@@ -726,7 +726,7 @@
         <w:t xml:space="preserve">, Coll. ID: </w:t>
       </w:r>
       <w:r>
-        <w:t>25-82 (1 genI).</w:t>
+        <w:t>25-82 (1 gen. I fund.).</w:t>
       </w:r>
     </w:p>
     <w:p>
@@ -752,22 +752,22 @@
         <w:t xml:space="preserve">, Coll. ID: </w:t>
       </w:r>
       <w:r>
-        <w:t xml:space="preserve">24-69 (1 genI, 4 genII), </w:t>
-      </w:r>
-      <w:r>
-        <w:t xml:space="preserve">24-70 (1 genI, 3 genII), </w:t>
-      </w:r>
-      <w:r>
-        <w:t xml:space="preserve">24-71 (1 genI, 5 genII), </w:t>
-      </w:r>
-      <w:r>
-        <w:t xml:space="preserve">24-72 (1 genI), </w:t>
-      </w:r>
-      <w:r>
-        <w:t xml:space="preserve">24-74 (1 genI, 6 genII), </w:t>
-      </w:r>
-      <w:r>
-        <w:t>24-75 (4 genII).</w:t>
+        <w:t xml:space="preserve">24-69 (1 gen. I fund., 4 gen. II al. vp.), </w:t>
+      </w:r>
+      <w:r>
+        <w:t xml:space="preserve">24-70 (1 gen. I fund., 3 gen. II al. vp.), </w:t>
+      </w:r>
+      <w:r>
+        <w:t xml:space="preserve">24-71 (1 gen. I fund., 5 gen. II al. vp.), </w:t>
+      </w:r>
+      <w:r>
+        <w:t xml:space="preserve">24-72 (1 gen. I fund.), </w:t>
+      </w:r>
+      <w:r>
+        <w:t xml:space="preserve">24-74 (1 gen. I fund., 6 gen. II al. vp.), </w:t>
+      </w:r>
+      <w:r>
+        <w:t>24-75 (4 gen. II al. vp.).</w:t>
       </w:r>
     </w:p>
     <w:p>
@@ -793,7 +793,7 @@
         <w:t xml:space="preserve">, Coll. ID: </w:t>
       </w:r>
       <w:r>
-        <w:t>23-18 (7 genVapt, 6 genValat).</w:t>
+        <w:t>23-18 (7 gen. V apt. vp., 6 gen. V al. sp.).</w:t>
       </w:r>
     </w:p>
     <w:p>
@@ -819,7 +819,7 @@
         <w:t xml:space="preserve">, Coll. ID: </w:t>
       </w:r>
       <w:r>
-        <w:t>23-13 (8 genII).</w:t>
+        <w:t>23-13 (8 gen. II al. vp.).</w:t>
       </w:r>
     </w:p>
     <w:p/>
@@ -847,7 +847,7 @@
         <w:t>Lectotype</w:t>
       </w:r>
       <w:r>
-        <w:t xml:space="preserve"> ♀ (Gen V al. Sp.): United States of America: Minnesota, Minneapolis, </w:t>
+        <w:t xml:space="preserve"> ♀ (gen. V al. sp.): United States of America: Minnesota, Minneapolis, </w:t>
       </w:r>
       <w:r>
         <w:rPr>
@@ -896,7 +896,7 @@
         <w:t>, 21.viii.1987, C. von Dohlen</w:t>
       </w:r>
       <w:r>
-        <w:t xml:space="preserve"> (2 Gen I fund.; 6, 7)</w:t>
+        <w:t xml:space="preserve"> (2 gen. I fund.; 6, 7)</w:t>
       </w:r>
       <w:r>
         <w:t xml:space="preserve"> [USU].</w:t>
@@ -916,7 +916,7 @@
         <w:t>, 26.vi.1988, C. von Dohlen</w:t>
       </w:r>
       <w:r>
-        <w:t xml:space="preserve"> (2 Gen I fund.; I-H-01, I-H-02)</w:t>
+        <w:t xml:space="preserve"> (2 gen. I fund.; I-H-01, I-H-02)</w:t>
       </w:r>
       <w:r>
         <w:t xml:space="preserve"> [USU].</w:t>
@@ -936,7 +936,7 @@
         <w:t>, ?, D. Stern</w:t>
       </w:r>
       <w:r>
-        <w:t xml:space="preserve"> (1 Gen I fund.; I-WV-01)</w:t>
+        <w:t xml:space="preserve"> (1 gen. I fund.; I-WV-01)</w:t>
       </w:r>
       <w:r>
         <w:t xml:space="preserve"> [USU].</w:t>
@@ -964,7 +964,7 @@
         <w:t>, 14.viii.1929, F. C. Hottes &amp; T. H. Frison</w:t>
       </w:r>
       <w:r>
-        <w:t xml:space="preserve"> (10 Gen II al. Vp.; S1.8143, S1.8145)</w:t>
+        <w:t xml:space="preserve"> (10 gen. II al. vp.; S1.8143, S1.8145)</w:t>
       </w:r>
       <w:r>
         <w:t xml:space="preserve"> [INHS acc. 1061514, 1068547].</w:t>
@@ -992,7 +992,7 @@
         <w:t>, 4.vi.1928, F. C. Hottes &amp; T. H. Frison</w:t>
       </w:r>
       <w:r>
-        <w:t xml:space="preserve"> (11 Gen V al. Sp.; S1.5791, S1.5792)</w:t>
+        <w:t xml:space="preserve"> (11 gen. V al. sp.; S1.5791, S1.5792)</w:t>
       </w:r>
       <w:r>
         <w:t xml:space="preserve"> [INHS acc. 1092556, 1092567].</w:t>
@@ -1012,7 +1012,7 @@
         <w:t>, 24.v.1988, C. von Dohlen</w:t>
       </w:r>
       <w:r>
-        <w:t xml:space="preserve"> (14 Gen V al. Sp.; bls1, bls2, bls3, bls4, bls5, bls6)</w:t>
+        <w:t xml:space="preserve"> (14 gen. V al. sp.; bls1, bls2, bls3, bls4, bls5, bls6)</w:t>
       </w:r>
       <w:r>
         <w:t xml:space="preserve"> [USU].</w:t>
@@ -1032,7 +1032,7 @@
         <w:t>, 8.v.1887, O. W. Oestlund</w:t>
       </w:r>
       <w:r>
-        <w:t xml:space="preserve"> (9 Gen V al. Sp.; 2046, 2046 A-17, 2046 A-22)</w:t>
+        <w:t xml:space="preserve"> (9 gen. V al. sp.; 2046, 2046 A-17, 2046 A-22)</w:t>
       </w:r>
       <w:r>
         <w:t xml:space="preserve"> (remounted xi.1968 in balsam) [UMSP].</w:t>
@@ -1052,7 +1052,7 @@
         <w:t>, 30.vi.1897, O. W. Oestlund</w:t>
       </w:r>
       <w:r>
-        <w:t xml:space="preserve"> (2 Gen V al. Sp.; 3775)</w:t>
+        <w:t xml:space="preserve"> (2 gen. V al. sp.; 3775)</w:t>
       </w:r>
       <w:r>
         <w:t xml:space="preserve"> (remounted xi.1968 in balsam) [UMSP].</w:t>
@@ -1072,7 +1072,7 @@
         <w:t>, 27.vi.1990, C. von Dohlen</w:t>
       </w:r>
       <w:r>
-        <w:t xml:space="preserve"> (18 Gen V al. Sp.; 134, 135, 136, 137, hni1, hni2)</w:t>
+        <w:t xml:space="preserve"> (18 gen. V al. sp.; 134, 135, 136, 137, hni1, hni2)</w:t>
       </w:r>
       <w:r>
         <w:t xml:space="preserve"> [USU].</w:t>

</xml_diff>